<commit_message>
docs: justificar mejora de persistencia local con localStorage en la documentacion
</commit_message>
<xml_diff>
--- a/respuestas.docx
+++ b/respuestas.docx
@@ -2059,6 +2059,55 @@
           <w:lang w:val="es-ES"/>
         </w:rPr>
       </w:pPr>
+    </w:p>
+    <w:p>
+      <w:r>
+        <w:rPr>
+          <w:b/>
+        </w:rPr>
+        <w:t>Sección 4: Mejoras aplicadas bajo criterio propio</w:t>
+      </w:r>
+    </w:p>
+    <w:p>
+      <w:r>
+        <w:rPr>
+          <w:b/>
+        </w:rPr>
+        <w:t>Persistencia local con localStorage</w:t>
+      </w:r>
+    </w:p>
+    <w:p>
+      <w:r>
+        <w:rPr>
+          <w:b/>
+        </w:rPr>
+        <w:t xml:space="preserve">Problema identificado: </w:t>
+      </w:r>
+      <w:r>
+        <w:t>Inicialmente la aplicación manejaba las tareas únicamente en memoria volátil. Al recargar la página o cerrar el navegador, cualquier tarea creada, completada o eliminada se perdía, obligando al usuario a empezar desde cero y restándole utilidad práctica.</w:t>
+      </w:r>
+    </w:p>
+    <w:p>
+      <w:r>
+        <w:rPr>
+          <w:b/>
+        </w:rPr>
+        <w:t xml:space="preserve">Solución implementada: </w:t>
+      </w:r>
+      <w:r>
+        <w:t>Se integró la API nativa de localStorage del navegador para sincronizar el estado del arreglo de tareas en cada acción (crear, alternar estado y eliminar), recuperando los datos almacenados automáticamente al abrir la aplicación.</w:t>
+      </w:r>
+    </w:p>
+    <w:p>
+      <w:r>
+        <w:rPr>
+          <w:b/>
+        </w:rPr>
+        <w:t xml:space="preserve">Justificación técnica y de UX: </w:t>
+      </w:r>
+      <w:r>
+        <w:t>Bajo criterio profesional de usabilidad y arquitectura de software, una aplicación de productividad debe garantizar la permanencia de la información del usuario sin obligar a montar una infraestructura compleja de backend o base de datos externa. localStorage ofrece una solución limpia, rápida, sin dependencias y de alta eficacia.</w:t>
+      </w:r>
     </w:p>
     <w:sectPr>
       <w:pgSz w:w="11906" w:h="16838" w:orient="portrait"/>

</xml_diff>

<commit_message>
docs: actualizar notas del proyecto
</commit_message>
<xml_diff>
--- a/respuestas.docx
+++ b/respuestas.docx
@@ -2070,43 +2070,7 @@
     </w:p>
     <w:p>
       <w:r>
-        <w:rPr>
-          <w:b/>
-        </w:rPr>
-        <w:t>Persistencia local con localStorage</w:t>
-      </w:r>
-    </w:p>
-    <w:p>
-      <w:r>
-        <w:rPr>
-          <w:b/>
-        </w:rPr>
-        <w:t xml:space="preserve">Problema identificado: </w:t>
-      </w:r>
-      <w:r>
-        <w:t>Inicialmente la aplicación manejaba las tareas únicamente en memoria volátil. Al recargar la página o cerrar el navegador, cualquier tarea creada, completada o eliminada se perdía, obligando al usuario a empezar desde cero y restándole utilidad práctica.</w:t>
-      </w:r>
-    </w:p>
-    <w:p>
-      <w:r>
-        <w:rPr>
-          <w:b/>
-        </w:rPr>
-        <w:t xml:space="preserve">Solución implementada: </w:t>
-      </w:r>
-      <w:r>
-        <w:t>Se integró la API nativa de localStorage del navegador para sincronizar el estado del arreglo de tareas en cada acción (crear, alternar estado y eliminar), recuperando los datos almacenados automáticamente al abrir la aplicación.</w:t>
-      </w:r>
-    </w:p>
-    <w:p>
-      <w:r>
-        <w:rPr>
-          <w:b/>
-        </w:rPr>
-        <w:t xml:space="preserve">Justificación técnica y de UX: </w:t>
-      </w:r>
-      <w:r>
-        <w:t>Bajo criterio profesional de usabilidad y arquitectura de software, una aplicación de productividad debe garantizar la permanencia de la información del usuario sin obligar a montar una infraestructura compleja de backend o base de datos externa. localStorage ofrece una solución limpia, rápida, sin dependencias y de alta eficacia.</w:t>
+        <w:t>Una lista de tareas en memoria pierde los datos al recargar la página. Con criterio de usabilidad, integré persistencia con localStorage para que el usuario mantenga sus tareas reales guardadas en su navegador sin necesidad de montar una base de datos pesada.</w:t>
       </w:r>
     </w:p>
     <w:sectPr>

</xml_diff>

<commit_message>
docs: documentar justificacion de niveles de prioridad
</commit_message>
<xml_diff>
--- a/respuestas.docx
+++ b/respuestas.docx
@@ -2070,7 +2070,24 @@
     </w:p>
     <w:p>
       <w:r>
+        <w:rPr>
+          <w:b/>
+        </w:rPr>
+        <w:t xml:space="preserve">1. Persistencia con localStorage: </w:t>
+      </w:r>
+      <w:r>
         <w:t>Una lista de tareas en memoria pierde los datos al recargar la página. Con criterio de usabilidad, integré persistencia con localStorage para que el usuario mantenga sus tareas reales guardadas en su navegador sin necesidad de montar una base de datos pesada.</w:t>
+      </w:r>
+    </w:p>
+    <w:p>
+      <w:r>
+        <w:rPr>
+          <w:b/>
+        </w:rPr>
+        <w:t xml:space="preserve">2. Niveles de prioridad (Alta, Media, Baja): </w:t>
+      </w:r>
+      <w:r>
+        <w:t>No todas las tareas tienen la misma urgencia en el día a día. Con criterio de organización y productividad, incorporé un selector de prioridades (Alta, Media, Baja) junto con etiquetas visuales de color, permitiendo al usuario jerarquizar de un vistazo sus actividades e identificar de inmediato los pendientes más críticos.</w:t>
       </w:r>
     </w:p>
     <w:sectPr>

</xml_diff>